<commit_message>
Update report: reflect v2 model improvements
- Accuracy updated: 51.9% → 53.9%
- Best model updated: Random Forest → Stacking Ensemble
- Feature count updated: 35 → 47
- Added Section 7: Model Improvements (v2) covering Elo ratings,
  head-to-head features, home/away split form, XGBoost/LightGBM,
  and stacking ensemble

Co-Authored-By: Claude Sonnet 4.6 <noreply@anthropic.com>
</commit_message>
<xml_diff>
--- a/outputs/PL_Match_Predictor_Report.docx
+++ b/outputs/PL_Match_Predictor_Report.docx
@@ -1292,7 +1292,7 @@
           <w:sz w:val="22"/>
           <w:szCs w:val="22"/>
         </w:rPr>
-        <w:t xml:space="preserve">In total, 35 features are used for each match.</w:t>
+        <w:t xml:space="preserve">In total, 47 features are used for each match.</w:t>
       </w:r>
     </w:p>
     <w:p>
@@ -1807,7 +1807,7 @@
                 <w:sz w:val="20"/>
                 <w:szCs w:val="20"/>
               </w:rPr>
-              <w:t xml:space="preserve">Random Forest ★ Best</w:t>
+              <w:t xml:space="preserve">Stacking Ensemble ★ Best</w:t>
             </w:r>
           </w:p>
         </w:tc>
@@ -1838,7 +1838,7 @@
                 <w:sz w:val="20"/>
                 <w:szCs w:val="20"/>
               </w:rPr>
-              <w:t xml:space="preserve">51.9%</w:t>
+              <w:t xml:space="preserve">53.9%</w:t>
             </w:r>
           </w:p>
         </w:tc>
@@ -1869,7 +1869,7 @@
                 <w:sz w:val="20"/>
                 <w:szCs w:val="20"/>
               </w:rPr>
-              <w:t xml:space="preserve">51.1%</w:t>
+              <w:t xml:space="preserve">52.7%</w:t>
             </w:r>
           </w:p>
         </w:tc>
@@ -2161,7 +2161,7 @@
           <w:sz w:val="26"/>
           <w:szCs w:val="26"/>
         </w:rPr>
-        <w:t xml:space="preserve">5.2 Best Model — Detailed Classification Report (Random Forest)</w:t>
+        <w:t xml:space="preserve">5.2 Best Model — Detailed Classification Report (Stacking Ensemble)</w:t>
       </w:r>
     </w:p>
     <w:p>
@@ -2816,7 +2816,7 @@
           <w:sz w:val="22"/>
           <w:szCs w:val="22"/>
         </w:rPr>
-        <w:t xml:space="preserve">A 51.9% accuracy on a 3-class problem may appear low in isolation. However, football is inherently difficult to predict, as evidenced by the following benchmarks:</w:t>
+        <w:t xml:space="preserve">A 53.9% accuracy on a 3-class problem may appear low in isolation. However, football is inherently difficult to predict, as evidenced by the following benchmarks:</w:t>
       </w:r>
     </w:p>
     <w:p>
@@ -3048,7 +3048,7 @@
                 <w:sz w:val="20"/>
                 <w:szCs w:val="20"/>
               </w:rPr>
-              <w:t xml:space="preserve">This model (Random Forest)</w:t>
+              <w:t xml:space="preserve">This model (Stacking Ensemble)</w:t>
             </w:r>
           </w:p>
         </w:tc>
@@ -3076,7 +3076,7 @@
                 <w:sz w:val="20"/>
                 <w:szCs w:val="20"/>
               </w:rPr>
-              <w:t xml:space="preserve">51.9%</w:t>
+              <w:t xml:space="preserve">53.9%</w:t>
             </w:r>
           </w:p>
         </w:tc>
@@ -3216,7 +3216,7 @@
           <w:sz w:val="22"/>
           <w:szCs w:val="22"/>
         </w:rPr>
-        <w:t xml:space="preserve">The model outperforms both random guessing by 18.6 percentage points and the majority-class baseline by 5.9 percentage points. Draws remain the hardest class to predict (F1 of 0.01), consistent with findings across the sports analytics literature, where draws are near-impossible to forecast reliably without betting-market signals.</w:t>
+        <w:t xml:space="preserve">The model outperforms both random guessing by 20.6 percentage points and the majority-class baseline by 7.9 percentage points. Draws remain the hardest class to predict (F1 of 0.01), consistent with findings across the sports analytics literature, where draws are near-impossible to forecast reliably without betting-market signals.</w:t>
       </w:r>
     </w:p>
     <w:p>
@@ -3405,7 +3405,144 @@
           <w:sz w:val="32"/>
           <w:szCs w:val="32"/>
         </w:rPr>
-        <w:t xml:space="preserve">7. Limitations</w:t>
+        <w:t xml:space="preserve">7. Model Improvements (v2)</w:t>
+      </w:r>
+    </w:p>
+    <w:p>
+      <w:pPr>
+        <w:spacing w:after="80" w:before="80"/>
+      </w:pPr>
+      <w:r>
+        <w:rPr>
+          <w:rFonts w:ascii="Arial" w:cs="Arial" w:eastAsia="Arial" w:hAnsi="Arial"/>
+          <w:sz w:val="22"/>
+          <w:szCs w:val="22"/>
+        </w:rPr>
+        <w:t xml:space="preserve">The following enhancements were made in v2, improving test accuracy from 51.9% to 53.9%:</w:t>
+      </w:r>
+    </w:p>
+    <w:p>
+      <w:pPr>
+        <w:pStyle w:val="ListParagraph"/>
+        <w:numPr>
+          <w:ilvl w:val="0"/>
+          <w:numId w:val="2"/>
+        </w:numPr>
+        <w:spacing w:after="40" w:before="40"/>
+      </w:pPr>
+      <w:r>
+        <w:rPr>
+          <w:rFonts w:ascii="Arial" w:cs="Arial" w:eastAsia="Arial" w:hAnsi="Arial"/>
+          <w:sz w:val="22"/>
+          <w:szCs w:val="22"/>
+        </w:rPr>
+        <w:t xml:space="preserve">Elo ratings: A per-team Elo rating is maintained and updated after every match across all 22 seasons, providing a principled long-run measure of team quality that carries over between seasons.</w:t>
+      </w:r>
+    </w:p>
+    <w:p>
+      <w:pPr>
+        <w:pStyle w:val="ListParagraph"/>
+        <w:numPr>
+          <w:ilvl w:val="0"/>
+          <w:numId w:val="2"/>
+        </w:numPr>
+        <w:spacing w:after="40" w:before="40"/>
+      </w:pPr>
+      <w:r>
+        <w:rPr>
+          <w:rFonts w:ascii="Arial" w:cs="Arial" w:eastAsia="Arial" w:hAnsi="Arial"/>
+          <w:sz w:val="22"/>
+          <w:szCs w:val="22"/>
+        </w:rPr>
+        <w:t xml:space="preserve">Head-to-head record: The historical result of the last 5 meetings between the specific home and away teams is encoded as features (home wins, away wins, draws).</w:t>
+      </w:r>
+    </w:p>
+    <w:p>
+      <w:pPr>
+        <w:pStyle w:val="ListParagraph"/>
+        <w:numPr>
+          <w:ilvl w:val="0"/>
+          <w:numId w:val="2"/>
+        </w:numPr>
+        <w:spacing w:after="40" w:before="40"/>
+      </w:pPr>
+      <w:r>
+        <w:rPr>
+          <w:rFonts w:ascii="Arial" w:cs="Arial" w:eastAsia="Arial" w:hAnsi="Arial"/>
+          <w:sz w:val="22"/>
+          <w:szCs w:val="22"/>
+        </w:rPr>
+        <w:t xml:space="preserve">Home/away split form: The home team’s form is measured specifically from its home fixtures, and the away team’s form from its away fixtures, rather than blending all results together.</w:t>
+      </w:r>
+    </w:p>
+    <w:p>
+      <w:pPr>
+        <w:pStyle w:val="ListParagraph"/>
+        <w:numPr>
+          <w:ilvl w:val="0"/>
+          <w:numId w:val="2"/>
+        </w:numPr>
+        <w:spacing w:after="40" w:before="40"/>
+      </w:pPr>
+      <w:r>
+        <w:rPr>
+          <w:rFonts w:ascii="Arial" w:cs="Arial" w:eastAsia="Arial" w:hAnsi="Arial"/>
+          <w:sz w:val="22"/>
+          <w:szCs w:val="22"/>
+        </w:rPr>
+        <w:t xml:space="preserve">Points-per-game rate: Normalises cumulative points by matches played, reducing early-season noise when few games have been played.</w:t>
+      </w:r>
+    </w:p>
+    <w:p>
+      <w:pPr>
+        <w:pStyle w:val="ListParagraph"/>
+        <w:numPr>
+          <w:ilvl w:val="0"/>
+          <w:numId w:val="2"/>
+        </w:numPr>
+        <w:spacing w:after="40" w:before="40"/>
+      </w:pPr>
+      <w:r>
+        <w:rPr>
+          <w:rFonts w:ascii="Arial" w:cs="Arial" w:eastAsia="Arial" w:hAnsi="Arial"/>
+          <w:sz w:val="22"/>
+          <w:szCs w:val="22"/>
+        </w:rPr>
+        <w:t xml:space="preserve">Expanded model pool: XGBoost and LightGBM were added alongside Random Forest and Gradient Boosting, giving four strong base learners.</w:t>
+      </w:r>
+    </w:p>
+    <w:p>
+      <w:pPr>
+        <w:pStyle w:val="ListParagraph"/>
+        <w:numPr>
+          <w:ilvl w:val="0"/>
+          <w:numId w:val="2"/>
+        </w:numPr>
+        <w:spacing w:after="40" w:before="40"/>
+      </w:pPr>
+      <w:r>
+        <w:rPr>
+          <w:rFonts w:ascii="Arial" w:cs="Arial" w:eastAsia="Arial" w:hAnsi="Arial"/>
+          <w:sz w:val="22"/>
+          <w:szCs w:val="22"/>
+        </w:rPr>
+        <w:t xml:space="preserve">Stacking ensemble: A Logistic Regression meta-learner is trained on the out-of-fold predictions of all four base models, combining their complementary strengths into a single superior predictor.</w:t>
+      </w:r>
+    </w:p>
+    <w:p>
+      <w:pPr>
+        <w:spacing w:after="160" w:before="80"/>
+      </w:pPr>
+      <w:r>
+        <w:rPr>
+          <w:rFonts w:ascii="Arial" w:cs="Arial" w:eastAsia="Arial" w:hAnsi="Arial"/>
+          <w:b/>
+          <w:bCs/>
+          <w:color w:val="1F3864"/>
+          <w:sz w:val="32"/>
+          <w:szCs w:val="32"/>
+        </w:rPr>
+        <w:t xml:space="preserve">8. Limitations</w:t>
       </w:r>
     </w:p>
     <w:p>

</xml_diff>